<commit_message>
Edital atualizado para 2026.1
</commit_message>
<xml_diff>
--- a/images/Ficha_Inscricao_LEA.docx
+++ b/images/Ficha_Inscricao_LEA.docx
@@ -9,13 +9,15 @@
         <w:rPr>
           <w:rFonts w:ascii="Calibri" w:cs="Calibri" w:eastAsia="Calibri" w:hAnsi="Calibri"/>
           <w:b w:val="0"/>
-          <w:vertAlign w:val="baseline"/>
-        </w:rPr>
-      </w:pPr>
-      <w:r>
-        <w:rPr>
-          <w:rFonts w:ascii="Calibri" w:cs="Calibri" w:eastAsia="Calibri" w:hAnsi="Calibri"/>
-          <w:b w:val="1"/>
+          <w:bCs w:val="0"/>
+          <w:vertAlign w:val="baseline"/>
+        </w:rPr>
+      </w:pPr>
+      <w:r>
+        <w:rPr>
+          <w:rFonts w:ascii="Calibri" w:cs="Calibri" w:eastAsia="Calibri" w:hAnsi="Calibri"/>
+          <w:b w:val="1"/>
+          <w:bCs w:val="1"/>
           <w:vertAlign w:val="baseline"/>
           <w:rtl w:val="0"/>
         </w:rPr>
@@ -39,12 +41,12 @@
             <wp:extent cx="1006540" cy="814659"/>
             <wp:effectExtent b="0" l="0" r="0" t="0"/>
             <wp:wrapNone/>
-            <wp:docPr id="3" name="image2.jpg"/>
+            <wp:docPr id="1" name="image1.jpg"/>
             <a:graphic>
               <a:graphicData uri="http://schemas.openxmlformats.org/drawingml/2006/picture">
                 <pic:pic>
                   <pic:nvPicPr>
-                    <pic:cNvPr id="0" name="image2.jpg"/>
+                    <pic:cNvPr id="0" name="image1.jpg"/>
                     <pic:cNvPicPr preferRelativeResize="0"/>
                   </pic:nvPicPr>
                   <pic:blipFill>
@@ -76,17 +78,17 @@
               <wp:posOffset>666115</wp:posOffset>
             </wp:positionH>
             <wp:positionV relativeFrom="paragraph">
-              <wp:posOffset>-90168</wp:posOffset>
+              <wp:posOffset>-89534</wp:posOffset>
             </wp:positionV>
             <wp:extent cx="720090" cy="810260"/>
             <wp:effectExtent b="0" l="0" r="0" t="0"/>
             <wp:wrapNone/>
-            <wp:docPr id="4" name="image1.png"/>
+            <wp:docPr id="2" name="image2.png"/>
             <a:graphic>
               <a:graphicData uri="http://schemas.openxmlformats.org/drawingml/2006/picture">
                 <pic:pic>
                   <pic:nvPicPr>
-                    <pic:cNvPr id="0" name="image1.png"/>
+                    <pic:cNvPr id="0" name="image2.png"/>
                     <pic:cNvPicPr preferRelativeResize="0"/>
                   </pic:nvPicPr>
                   <pic:blipFill>
@@ -118,13 +120,15 @@
         <w:rPr>
           <w:rFonts w:ascii="Calibri" w:cs="Calibri" w:eastAsia="Calibri" w:hAnsi="Calibri"/>
           <w:b w:val="0"/>
-          <w:vertAlign w:val="baseline"/>
-        </w:rPr>
-      </w:pPr>
-      <w:r>
-        <w:rPr>
-          <w:rFonts w:ascii="Calibri" w:cs="Calibri" w:eastAsia="Calibri" w:hAnsi="Calibri"/>
-          <w:b w:val="1"/>
+          <w:bCs w:val="0"/>
+          <w:vertAlign w:val="baseline"/>
+        </w:rPr>
+      </w:pPr>
+      <w:r>
+        <w:rPr>
+          <w:rFonts w:ascii="Calibri" w:cs="Calibri" w:eastAsia="Calibri" w:hAnsi="Calibri"/>
+          <w:b w:val="1"/>
+          <w:bCs w:val="1"/>
           <w:vertAlign w:val="baseline"/>
           <w:rtl w:val="0"/>
         </w:rPr>
@@ -143,13 +147,15 @@
         <w:rPr>
           <w:rFonts w:ascii="Calibri" w:cs="Calibri" w:eastAsia="Calibri" w:hAnsi="Calibri"/>
           <w:b w:val="0"/>
-          <w:vertAlign w:val="baseline"/>
-        </w:rPr>
-      </w:pPr>
-      <w:r>
-        <w:rPr>
-          <w:rFonts w:ascii="Calibri" w:cs="Calibri" w:eastAsia="Calibri" w:hAnsi="Calibri"/>
-          <w:b w:val="1"/>
+          <w:bCs w:val="0"/>
+          <w:vertAlign w:val="baseline"/>
+        </w:rPr>
+      </w:pPr>
+      <w:r>
+        <w:rPr>
+          <w:rFonts w:ascii="Calibri" w:cs="Calibri" w:eastAsia="Calibri" w:hAnsi="Calibri"/>
+          <w:b w:val="1"/>
+          <w:bCs w:val="1"/>
           <w:vertAlign w:val="baseline"/>
           <w:rtl w:val="0"/>
         </w:rPr>
@@ -168,13 +174,15 @@
         <w:rPr>
           <w:rFonts w:ascii="Calibri" w:cs="Calibri" w:eastAsia="Calibri" w:hAnsi="Calibri"/>
           <w:b w:val="0"/>
-          <w:vertAlign w:val="baseline"/>
-        </w:rPr>
-      </w:pPr>
-      <w:r>
-        <w:rPr>
-          <w:rFonts w:ascii="Calibri" w:cs="Calibri" w:eastAsia="Calibri" w:hAnsi="Calibri"/>
-          <w:b w:val="1"/>
+          <w:bCs w:val="0"/>
+          <w:vertAlign w:val="baseline"/>
+        </w:rPr>
+      </w:pPr>
+      <w:r>
+        <w:rPr>
+          <w:rFonts w:ascii="Calibri" w:cs="Calibri" w:eastAsia="Calibri" w:hAnsi="Calibri"/>
+          <w:b w:val="1"/>
+          <w:bCs w:val="1"/>
           <w:vertAlign w:val="baseline"/>
           <w:rtl w:val="0"/>
         </w:rPr>
@@ -193,6 +201,7 @@
         <w:rPr>
           <w:rFonts w:ascii="Calibri" w:cs="Calibri" w:eastAsia="Calibri" w:hAnsi="Calibri"/>
           <w:b w:val="0"/>
+          <w:bCs w:val="0"/>
           <w:vertAlign w:val="baseline"/>
         </w:rPr>
       </w:pPr>
@@ -226,11 +235,11 @@
           <w:numId w:val="1"/>
         </w:numPr>
         <w:pBdr>
-          <w:top w:space="0" w:sz="0" w:val="nil"/>
-          <w:left w:space="0" w:sz="0" w:val="nil"/>
-          <w:bottom w:space="0" w:sz="0" w:val="nil"/>
-          <w:right w:space="0" w:sz="0" w:val="nil"/>
-          <w:between w:space="0" w:sz="0" w:val="nil"/>
+          <w:top w:color="000000" w:space="0" w:sz="0" w:val="none"/>
+          <w:left w:color="000000" w:space="0" w:sz="0" w:val="none"/>
+          <w:bottom w:color="000000" w:space="0" w:sz="0" w:val="none"/>
+          <w:right w:color="000000" w:space="0" w:sz="0" w:val="none"/>
+          <w:between w:color="000000" w:space="0" w:sz="0" w:val="none"/>
         </w:pBdr>
         <w:shd w:fill="auto" w:val="clear"/>
         <w:spacing w:after="0" w:before="0" w:line="240" w:lineRule="auto"/>
@@ -239,7 +248,9 @@
         <w:rPr>
           <w:rFonts w:ascii="Calibri" w:cs="Calibri" w:eastAsia="Calibri" w:hAnsi="Calibri"/>
           <w:b w:val="1"/>
+          <w:bCs w:val="1"/>
           <w:i w:val="0"/>
+          <w:iCs w:val="0"/>
           <w:smallCaps w:val="0"/>
           <w:strike w:val="0"/>
           <w:color w:val="000000"/>
@@ -254,7 +265,9 @@
         <w:rPr>
           <w:rFonts w:ascii="Calibri" w:cs="Calibri" w:eastAsia="Calibri" w:hAnsi="Calibri"/>
           <w:b w:val="1"/>
+          <w:bCs w:val="1"/>
           <w:i w:val="0"/>
+          <w:iCs w:val="0"/>
           <w:smallCaps w:val="0"/>
           <w:strike w:val="0"/>
           <w:color w:val="000000"/>
@@ -275,13 +288,15 @@
         <w:rPr>
           <w:rFonts w:ascii="Calibri" w:cs="Calibri" w:eastAsia="Calibri" w:hAnsi="Calibri"/>
           <w:b w:val="0"/>
-          <w:vertAlign w:val="baseline"/>
-        </w:rPr>
-      </w:pPr>
-      <w:r>
-        <w:rPr>
-          <w:rFonts w:ascii="Calibri" w:cs="Calibri" w:eastAsia="Calibri" w:hAnsi="Calibri"/>
-          <w:b w:val="1"/>
+          <w:bCs w:val="0"/>
+          <w:vertAlign w:val="baseline"/>
+        </w:rPr>
+      </w:pPr>
+      <w:r>
+        <w:rPr>
+          <w:rFonts w:ascii="Calibri" w:cs="Calibri" w:eastAsia="Calibri" w:hAnsi="Calibri"/>
+          <w:b w:val="1"/>
+          <w:bCs w:val="1"/>
           <w:vertAlign w:val="baseline"/>
           <w:rtl w:val="0"/>
         </w:rPr>
@@ -291,53 +306,56 @@
         <w:rPr>
           <w:rFonts w:ascii="Calibri" w:cs="Calibri" w:eastAsia="Calibri" w:hAnsi="Calibri"/>
           <w:b w:val="1"/>
-          <w:rtl w:val="0"/>
-        </w:rPr>
-        <w:t xml:space="preserve">1/2025</w:t>
-      </w:r>
-      <w:r>
-        <w:rPr>
-          <w:rtl w:val="0"/>
-        </w:rPr>
-      </w:r>
-    </w:p>
-    <w:p>
-      <w:pPr>
-        <w:pageBreakBefore w:val="0"/>
-        <w:spacing w:line="360" w:lineRule="auto"/>
-        <w:rPr>
-          <w:rFonts w:ascii="Calibri" w:cs="Calibri" w:eastAsia="Calibri" w:hAnsi="Calibri"/>
-          <w:vertAlign w:val="baseline"/>
-        </w:rPr>
-      </w:pPr>
-      <w:r>
-        <w:rPr>
-          <w:rFonts w:ascii="Calibri" w:cs="Calibri" w:eastAsia="Calibri" w:hAnsi="Calibri"/>
-          <w:b w:val="1"/>
-          <w:vertAlign w:val="baseline"/>
-          <w:rtl w:val="0"/>
-        </w:rPr>
-        <w:tab/>
-      </w:r>
-      <w:r>
-        <w:rPr>
-          <w:rtl w:val="0"/>
-        </w:rPr>
-      </w:r>
-    </w:p>
-    <w:p>
-      <w:pPr>
-        <w:pageBreakBefore w:val="0"/>
-        <w:spacing w:line="360" w:lineRule="auto"/>
-        <w:rPr>
-          <w:rFonts w:ascii="Calibri" w:cs="Calibri" w:eastAsia="Calibri" w:hAnsi="Calibri"/>
-          <w:vertAlign w:val="baseline"/>
-        </w:rPr>
-      </w:pPr>
-      <w:r>
-        <w:rPr>
-          <w:rFonts w:ascii="Calibri" w:cs="Calibri" w:eastAsia="Calibri" w:hAnsi="Calibri"/>
-          <w:b w:val="1"/>
+          <w:bCs w:val="1"/>
+          <w:rtl w:val="0"/>
+        </w:rPr>
+        <w:t xml:space="preserve">1/2026</w:t>
+      </w:r>
+      <w:r>
+        <w:rPr>
+          <w:rtl w:val="0"/>
+        </w:rPr>
+      </w:r>
+    </w:p>
+    <w:p>
+      <w:pPr>
+        <w:pageBreakBefore w:val="0"/>
+        <w:spacing w:line="360" w:lineRule="auto"/>
+        <w:rPr>
+          <w:rFonts w:ascii="Calibri" w:cs="Calibri" w:eastAsia="Calibri" w:hAnsi="Calibri"/>
+          <w:vertAlign w:val="baseline"/>
+        </w:rPr>
+      </w:pPr>
+      <w:r>
+        <w:rPr>
+          <w:rFonts w:ascii="Calibri" w:cs="Calibri" w:eastAsia="Calibri" w:hAnsi="Calibri"/>
+          <w:b w:val="1"/>
+          <w:bCs w:val="1"/>
+          <w:vertAlign w:val="baseline"/>
+          <w:rtl w:val="0"/>
+        </w:rPr>
+        <w:tab/>
+      </w:r>
+      <w:r>
+        <w:rPr>
+          <w:rtl w:val="0"/>
+        </w:rPr>
+      </w:r>
+    </w:p>
+    <w:p>
+      <w:pPr>
+        <w:pageBreakBefore w:val="0"/>
+        <w:spacing w:line="360" w:lineRule="auto"/>
+        <w:rPr>
+          <w:rFonts w:ascii="Calibri" w:cs="Calibri" w:eastAsia="Calibri" w:hAnsi="Calibri"/>
+          <w:vertAlign w:val="baseline"/>
+        </w:rPr>
+      </w:pPr>
+      <w:r>
+        <w:rPr>
+          <w:rFonts w:ascii="Calibri" w:cs="Calibri" w:eastAsia="Calibri" w:hAnsi="Calibri"/>
+          <w:b w:val="1"/>
+          <w:bCs w:val="1"/>
           <w:vertAlign w:val="baseline"/>
           <w:rtl w:val="0"/>
         </w:rPr>
@@ -356,13 +374,15 @@
         <w:rPr>
           <w:rFonts w:ascii="Calibri" w:cs="Calibri" w:eastAsia="Calibri" w:hAnsi="Calibri"/>
           <w:b w:val="1"/>
-          <w:vertAlign w:val="baseline"/>
-        </w:rPr>
-      </w:pPr>
-      <w:r>
-        <w:rPr>
-          <w:rFonts w:ascii="Calibri" w:cs="Calibri" w:eastAsia="Calibri" w:hAnsi="Calibri"/>
-          <w:b w:val="1"/>
+          <w:bCs w:val="1"/>
+          <w:vertAlign w:val="baseline"/>
+        </w:rPr>
+      </w:pPr>
+      <w:r>
+        <w:rPr>
+          <w:rFonts w:ascii="Calibri" w:cs="Calibri" w:eastAsia="Calibri" w:hAnsi="Calibri"/>
+          <w:b w:val="1"/>
+          <w:bCs w:val="1"/>
           <w:vertAlign w:val="baseline"/>
           <w:rtl w:val="0"/>
         </w:rPr>
@@ -376,12 +396,14 @@
         <w:rPr>
           <w:rFonts w:ascii="Calibri" w:cs="Calibri" w:eastAsia="Calibri" w:hAnsi="Calibri"/>
           <w:b w:val="1"/>
-        </w:rPr>
-      </w:pPr>
-      <w:r>
-        <w:rPr>
-          <w:rFonts w:ascii="Calibri" w:cs="Calibri" w:eastAsia="Calibri" w:hAnsi="Calibri"/>
-          <w:b w:val="1"/>
+          <w:bCs w:val="1"/>
+        </w:rPr>
+      </w:pPr>
+      <w:r>
+        <w:rPr>
+          <w:rFonts w:ascii="Calibri" w:cs="Calibri" w:eastAsia="Calibri" w:hAnsi="Calibri"/>
+          <w:b w:val="1"/>
+          <w:bCs w:val="1"/>
           <w:rtl w:val="0"/>
         </w:rPr>
         <w:t xml:space="preserve">CURSO:</w:t>
@@ -400,6 +422,7 @@
         <w:rPr>
           <w:rFonts w:ascii="Calibri" w:cs="Calibri" w:eastAsia="Calibri" w:hAnsi="Calibri"/>
           <w:b w:val="1"/>
+          <w:bCs w:val="1"/>
           <w:vertAlign w:val="baseline"/>
           <w:rtl w:val="0"/>
         </w:rPr>
@@ -424,6 +447,7 @@
         <w:rPr>
           <w:rFonts w:ascii="Calibri" w:cs="Calibri" w:eastAsia="Calibri" w:hAnsi="Calibri"/>
           <w:b w:val="1"/>
+          <w:bCs w:val="1"/>
           <w:vertAlign w:val="baseline"/>
           <w:rtl w:val="0"/>
         </w:rPr>
@@ -448,6 +472,7 @@
         <w:rPr>
           <w:rFonts w:ascii="Calibri" w:cs="Calibri" w:eastAsia="Calibri" w:hAnsi="Calibri"/>
           <w:b w:val="1"/>
+          <w:bCs w:val="1"/>
           <w:vertAlign w:val="baseline"/>
           <w:rtl w:val="0"/>
         </w:rPr>
@@ -472,6 +497,7 @@
         <w:rPr>
           <w:rFonts w:ascii="Calibri" w:cs="Calibri" w:eastAsia="Calibri" w:hAnsi="Calibri"/>
           <w:b w:val="1"/>
+          <w:bCs w:val="1"/>
           <w:vertAlign w:val="baseline"/>
           <w:rtl w:val="0"/>
         </w:rPr>
@@ -588,6 +614,7 @@
         <w:rPr>
           <w:rFonts w:ascii="Calibri" w:cs="Calibri" w:eastAsia="Calibri" w:hAnsi="Calibri"/>
           <w:b w:val="1"/>
+          <w:bCs w:val="1"/>
           <w:vertAlign w:val="baseline"/>
           <w:rtl w:val="0"/>
         </w:rPr>
@@ -606,13 +633,15 @@
         <w:rPr>
           <w:rFonts w:ascii="Calibri" w:cs="Calibri" w:eastAsia="Calibri" w:hAnsi="Calibri"/>
           <w:b w:val="0"/>
-          <w:vertAlign w:val="baseline"/>
-        </w:rPr>
-      </w:pPr>
-      <w:r>
-        <w:rPr>
-          <w:rFonts w:ascii="Calibri" w:cs="Calibri" w:eastAsia="Calibri" w:hAnsi="Calibri"/>
-          <w:b w:val="1"/>
+          <w:bCs w:val="0"/>
+          <w:vertAlign w:val="baseline"/>
+        </w:rPr>
+      </w:pPr>
+      <w:r>
+        <w:rPr>
+          <w:rFonts w:ascii="Calibri" w:cs="Calibri" w:eastAsia="Calibri" w:hAnsi="Calibri"/>
+          <w:b w:val="1"/>
+          <w:bCs w:val="1"/>
           <w:vertAlign w:val="baseline"/>
           <w:rtl w:val="0"/>
         </w:rPr>
@@ -631,6 +660,7 @@
         <w:rPr>
           <w:rFonts w:ascii="Calibri" w:cs="Calibri" w:eastAsia="Calibri" w:hAnsi="Calibri"/>
           <w:b w:val="0"/>
+          <w:bCs w:val="0"/>
           <w:vertAlign w:val="baseline"/>
         </w:rPr>
       </w:pPr>
@@ -647,6 +677,7 @@
         <w:rPr>
           <w:rFonts w:ascii="Calibri" w:cs="Calibri" w:eastAsia="Calibri" w:hAnsi="Calibri"/>
           <w:b w:val="0"/>
+          <w:bCs w:val="0"/>
           <w:vertAlign w:val="baseline"/>
         </w:rPr>
       </w:pPr>
@@ -663,6 +694,7 @@
         <w:rPr>
           <w:rFonts w:ascii="Calibri" w:cs="Calibri" w:eastAsia="Calibri" w:hAnsi="Calibri"/>
           <w:b w:val="0"/>
+          <w:bCs w:val="0"/>
           <w:vertAlign w:val="baseline"/>
         </w:rPr>
       </w:pPr>
@@ -679,6 +711,7 @@
         <w:rPr>
           <w:rFonts w:ascii="Calibri" w:cs="Calibri" w:eastAsia="Calibri" w:hAnsi="Calibri"/>
           <w:b w:val="0"/>
+          <w:bCs w:val="0"/>
           <w:vertAlign w:val="baseline"/>
         </w:rPr>
       </w:pPr>
@@ -695,13 +728,15 @@
         <w:rPr>
           <w:rFonts w:ascii="Calibri" w:cs="Calibri" w:eastAsia="Calibri" w:hAnsi="Calibri"/>
           <w:b w:val="0"/>
-          <w:vertAlign w:val="baseline"/>
-        </w:rPr>
-      </w:pPr>
-      <w:r>
-        <w:rPr>
-          <w:rFonts w:ascii="Calibri" w:cs="Calibri" w:eastAsia="Calibri" w:hAnsi="Calibri"/>
-          <w:b w:val="1"/>
+          <w:bCs w:val="0"/>
+          <w:vertAlign w:val="baseline"/>
+        </w:rPr>
+      </w:pPr>
+      <w:r>
+        <w:rPr>
+          <w:rFonts w:ascii="Calibri" w:cs="Calibri" w:eastAsia="Calibri" w:hAnsi="Calibri"/>
+          <w:b w:val="1"/>
+          <w:bCs w:val="1"/>
           <w:vertAlign w:val="baseline"/>
           <w:rtl w:val="0"/>
         </w:rPr>
@@ -720,6 +755,7 @@
         <w:rPr>
           <w:rFonts w:ascii="Calibri" w:cs="Calibri" w:eastAsia="Calibri" w:hAnsi="Calibri"/>
           <w:b w:val="0"/>
+          <w:bCs w:val="0"/>
           <w:vertAlign w:val="baseline"/>
         </w:rPr>
       </w:pPr>
@@ -736,6 +772,7 @@
         <w:rPr>
           <w:rFonts w:ascii="Calibri" w:cs="Calibri" w:eastAsia="Calibri" w:hAnsi="Calibri"/>
           <w:b w:val="0"/>
+          <w:bCs w:val="0"/>
           <w:vertAlign w:val="baseline"/>
         </w:rPr>
       </w:pPr>
@@ -752,13 +789,15 @@
         <w:rPr>
           <w:rFonts w:ascii="Calibri" w:cs="Calibri" w:eastAsia="Calibri" w:hAnsi="Calibri"/>
           <w:b w:val="0"/>
-          <w:vertAlign w:val="baseline"/>
-        </w:rPr>
-      </w:pPr>
-      <w:r>
-        <w:rPr>
-          <w:rFonts w:ascii="Calibri" w:cs="Calibri" w:eastAsia="Calibri" w:hAnsi="Calibri"/>
-          <w:b w:val="1"/>
+          <w:bCs w:val="0"/>
+          <w:vertAlign w:val="baseline"/>
+        </w:rPr>
+      </w:pPr>
+      <w:r>
+        <w:rPr>
+          <w:rFonts w:ascii="Calibri" w:cs="Calibri" w:eastAsia="Calibri" w:hAnsi="Calibri"/>
+          <w:b w:val="1"/>
+          <w:bCs w:val="1"/>
           <w:vertAlign w:val="baseline"/>
           <w:rtl w:val="0"/>
         </w:rPr>
@@ -777,6 +816,7 @@
         <w:rPr>
           <w:rFonts w:ascii="Calibri" w:cs="Calibri" w:eastAsia="Calibri" w:hAnsi="Calibri"/>
           <w:b w:val="0"/>
+          <w:bCs w:val="0"/>
           <w:vertAlign w:val="baseline"/>
         </w:rPr>
       </w:pPr>
@@ -793,43 +833,45 @@
         <w:rPr>
           <w:rFonts w:ascii="Calibri" w:cs="Calibri" w:eastAsia="Calibri" w:hAnsi="Calibri"/>
           <w:b w:val="0"/>
-          <w:vertAlign w:val="baseline"/>
-        </w:rPr>
-      </w:pPr>
-      <w:r>
-        <w:rPr>
-          <w:rtl w:val="0"/>
-        </w:rPr>
-      </w:r>
-    </w:p>
-    <w:p>
-      <w:pPr>
-        <w:pageBreakBefore w:val="0"/>
-        <w:spacing w:line="360" w:lineRule="auto"/>
-        <w:rPr>
-          <w:rFonts w:ascii="Calibri" w:cs="Calibri" w:eastAsia="Calibri" w:hAnsi="Calibri"/>
-          <w:vertAlign w:val="baseline"/>
-        </w:rPr>
-      </w:pPr>
-      <w:r>
-        <w:rPr>
-          <w:rtl w:val="0"/>
-        </w:rPr>
-      </w:r>
-    </w:p>
-    <w:p>
-      <w:pPr>
-        <w:pageBreakBefore w:val="0"/>
-        <w:spacing w:line="360" w:lineRule="auto"/>
-        <w:rPr>
-          <w:rFonts w:ascii="Calibri" w:cs="Calibri" w:eastAsia="Calibri" w:hAnsi="Calibri"/>
-          <w:vertAlign w:val="baseline"/>
-        </w:rPr>
-      </w:pPr>
-      <w:r>
-        <w:rPr>
-          <w:rFonts w:ascii="Calibri" w:cs="Calibri" w:eastAsia="Calibri" w:hAnsi="Calibri"/>
-          <w:b w:val="1"/>
+          <w:bCs w:val="0"/>
+          <w:vertAlign w:val="baseline"/>
+        </w:rPr>
+      </w:pPr>
+      <w:r>
+        <w:rPr>
+          <w:rtl w:val="0"/>
+        </w:rPr>
+      </w:r>
+    </w:p>
+    <w:p>
+      <w:pPr>
+        <w:pageBreakBefore w:val="0"/>
+        <w:spacing w:line="360" w:lineRule="auto"/>
+        <w:rPr>
+          <w:rFonts w:ascii="Calibri" w:cs="Calibri" w:eastAsia="Calibri" w:hAnsi="Calibri"/>
+          <w:vertAlign w:val="baseline"/>
+        </w:rPr>
+      </w:pPr>
+      <w:r>
+        <w:rPr>
+          <w:rtl w:val="0"/>
+        </w:rPr>
+      </w:r>
+    </w:p>
+    <w:p>
+      <w:pPr>
+        <w:pageBreakBefore w:val="0"/>
+        <w:spacing w:line="360" w:lineRule="auto"/>
+        <w:rPr>
+          <w:rFonts w:ascii="Calibri" w:cs="Calibri" w:eastAsia="Calibri" w:hAnsi="Calibri"/>
+          <w:vertAlign w:val="baseline"/>
+        </w:rPr>
+      </w:pPr>
+      <w:r>
+        <w:rPr>
+          <w:rFonts w:ascii="Calibri" w:cs="Calibri" w:eastAsia="Calibri" w:hAnsi="Calibri"/>
+          <w:b w:val="1"/>
+          <w:bCs w:val="1"/>
           <w:vertAlign w:val="baseline"/>
           <w:rtl w:val="0"/>
         </w:rPr>
@@ -950,6 +992,7 @@
         <w:rPr>
           <w:rFonts w:ascii="Calibri" w:cs="Calibri" w:eastAsia="Calibri" w:hAnsi="Calibri"/>
           <w:b w:val="1"/>
+          <w:bCs w:val="1"/>
           <w:vertAlign w:val="baseline"/>
           <w:rtl w:val="0"/>
         </w:rPr>
@@ -968,28 +1011,30 @@
         <w:rPr>
           <w:rFonts w:ascii="Calibri" w:cs="Calibri" w:eastAsia="Calibri" w:hAnsi="Calibri"/>
           <w:b w:val="0"/>
-          <w:vertAlign w:val="baseline"/>
-        </w:rPr>
-      </w:pPr>
-      <w:r>
-        <w:rPr>
-          <w:rtl w:val="0"/>
-        </w:rPr>
-      </w:r>
-    </w:p>
-    <w:p>
-      <w:pPr>
-        <w:pageBreakBefore w:val="0"/>
-        <w:spacing w:line="360" w:lineRule="auto"/>
-        <w:rPr>
-          <w:rFonts w:ascii="Calibri" w:cs="Calibri" w:eastAsia="Calibri" w:hAnsi="Calibri"/>
-          <w:vertAlign w:val="baseline"/>
-        </w:rPr>
-      </w:pPr>
-      <w:r>
-        <w:rPr>
-          <w:rFonts w:ascii="Calibri" w:cs="Calibri" w:eastAsia="Calibri" w:hAnsi="Calibri"/>
-          <w:b w:val="1"/>
+          <w:bCs w:val="0"/>
+          <w:vertAlign w:val="baseline"/>
+        </w:rPr>
+      </w:pPr>
+      <w:r>
+        <w:rPr>
+          <w:rtl w:val="0"/>
+        </w:rPr>
+      </w:r>
+    </w:p>
+    <w:p>
+      <w:pPr>
+        <w:pageBreakBefore w:val="0"/>
+        <w:spacing w:line="360" w:lineRule="auto"/>
+        <w:rPr>
+          <w:rFonts w:ascii="Calibri" w:cs="Calibri" w:eastAsia="Calibri" w:hAnsi="Calibri"/>
+          <w:vertAlign w:val="baseline"/>
+        </w:rPr>
+      </w:pPr>
+      <w:r>
+        <w:rPr>
+          <w:rFonts w:ascii="Calibri" w:cs="Calibri" w:eastAsia="Calibri" w:hAnsi="Calibri"/>
+          <w:b w:val="1"/>
+          <w:bCs w:val="1"/>
           <w:vertAlign w:val="baseline"/>
           <w:rtl w:val="0"/>
         </w:rPr>
@@ -1014,6 +1059,7 @@
         <w:rPr>
           <w:rFonts w:ascii="Calibri" w:cs="Calibri" w:eastAsia="Calibri" w:hAnsi="Calibri"/>
           <w:b w:val="1"/>
+          <w:bCs w:val="1"/>
           <w:vertAlign w:val="baseline"/>
           <w:rtl w:val="0"/>
         </w:rPr>
@@ -1045,6 +1091,7 @@
         <w:rPr>
           <w:rFonts w:ascii="Calibri" w:cs="Calibri" w:eastAsia="Calibri" w:hAnsi="Calibri"/>
           <w:b w:val="1"/>
+          <w:bCs w:val="1"/>
           <w:vertAlign w:val="baseline"/>
           <w:rtl w:val="0"/>
         </w:rPr>
@@ -1070,6 +1117,7 @@
         <w:rPr>
           <w:rFonts w:ascii="Calibri" w:cs="Calibri" w:eastAsia="Calibri" w:hAnsi="Calibri"/>
           <w:b w:val="0"/>
+          <w:bCs w:val="0"/>
           <w:vertAlign w:val="baseline"/>
         </w:rPr>
       </w:pPr>
@@ -1086,33 +1134,37 @@
         <w:rPr>
           <w:rFonts w:ascii="Calibri" w:cs="Calibri" w:eastAsia="Calibri" w:hAnsi="Calibri"/>
           <w:b w:val="0"/>
-          <w:vertAlign w:val="baseline"/>
-        </w:rPr>
-      </w:pPr>
-      <w:r>
-        <w:rPr>
-          <w:rFonts w:ascii="Calibri" w:cs="Calibri" w:eastAsia="Calibri" w:hAnsi="Calibri"/>
-          <w:b w:val="1"/>
-          <w:vertAlign w:val="baseline"/>
-          <w:rtl w:val="0"/>
-        </w:rPr>
-        <w:t xml:space="preserve">TEM INTERESSE EM PUBLICAR TRABALHOS EM CO-AUTORIA COM A EQUIPE DO LEA?            </w:t>
-      </w:r>
-      <w:r>
-        <w:rPr>
-          <w:rtl w:val="0"/>
-        </w:rPr>
-      </w:r>
-    </w:p>
-    <w:p>
-      <w:pPr>
-        <w:pageBreakBefore w:val="0"/>
-        <w:spacing w:line="360" w:lineRule="auto"/>
-        <w:rPr>
-          <w:rFonts w:ascii="Calibri" w:cs="Calibri" w:eastAsia="Calibri" w:hAnsi="Calibri"/>
-          <w:vertAlign w:val="baseline"/>
-        </w:rPr>
-      </w:pPr>
+          <w:bCs w:val="0"/>
+          <w:vertAlign w:val="baseline"/>
+        </w:rPr>
+      </w:pPr>
+      <w:r>
+        <w:rPr>
+          <w:rFonts w:ascii="Calibri" w:cs="Calibri" w:eastAsia="Calibri" w:hAnsi="Calibri"/>
+          <w:b w:val="1"/>
+          <w:bCs w:val="1"/>
+          <w:vertAlign w:val="baseline"/>
+          <w:rtl w:val="0"/>
+        </w:rPr>
+        <w:t xml:space="preserve">TEM INTERESSE EM PUBLICAR TRABALHOS COM OS RESULTADOS DA CONSULTORIA?            </w:t>
+      </w:r>
+      <w:r>
+        <w:rPr>
+          <w:rtl w:val="0"/>
+        </w:rPr>
+      </w:r>
+    </w:p>
+    <w:p>
+      <w:pPr>
+        <w:pageBreakBefore w:val="0"/>
+        <w:spacing w:line="360" w:lineRule="auto"/>
+        <w:rPr>
+          <w:rFonts w:ascii="Calibri" w:cs="Calibri" w:eastAsia="Calibri" w:hAnsi="Calibri"/>
+          <w:vertAlign w:val="baseline"/>
+        </w:rPr>
+      </w:pPr>
+      <w:bookmarkStart w:colFirst="0" w:colLast="0" w:name="_heading=h.vhzmt1337gfj" w:id="0"/>
+      <w:bookmarkEnd w:id="0"/>
       <w:r>
         <w:rPr>
           <w:rFonts w:ascii="Calibri" w:cs="Calibri" w:eastAsia="Calibri" w:hAnsi="Calibri"/>
@@ -1132,6 +1184,7 @@
         <w:rPr>
           <w:rFonts w:ascii="Calibri" w:cs="Calibri" w:eastAsia="Calibri" w:hAnsi="Calibri"/>
           <w:b w:val="0"/>
+          <w:bCs w:val="0"/>
           <w:vertAlign w:val="baseline"/>
         </w:rPr>
       </w:pPr>
@@ -1147,13 +1200,15 @@
         <w:rPr>
           <w:rFonts w:ascii="Calibri" w:cs="Calibri" w:eastAsia="Calibri" w:hAnsi="Calibri"/>
           <w:b w:val="0"/>
-          <w:vertAlign w:val="baseline"/>
-        </w:rPr>
-      </w:pPr>
-      <w:r>
-        <w:rPr>
-          <w:rFonts w:ascii="Calibri" w:cs="Calibri" w:eastAsia="Calibri" w:hAnsi="Calibri"/>
-          <w:b w:val="1"/>
+          <w:bCs w:val="0"/>
+          <w:vertAlign w:val="baseline"/>
+        </w:rPr>
+      </w:pPr>
+      <w:r>
+        <w:rPr>
+          <w:rFonts w:ascii="Calibri" w:cs="Calibri" w:eastAsia="Calibri" w:hAnsi="Calibri"/>
+          <w:b w:val="1"/>
+          <w:bCs w:val="1"/>
           <w:vertAlign w:val="baseline"/>
           <w:rtl w:val="0"/>
         </w:rPr>
@@ -1217,6 +1272,7 @@
         <w:rPr>
           <w:rFonts w:ascii="Calibri" w:cs="Calibri" w:eastAsia="Calibri" w:hAnsi="Calibri"/>
           <w:b w:val="1"/>
+          <w:bCs w:val="1"/>
           <w:vertAlign w:val="baseline"/>
           <w:rtl w:val="0"/>
         </w:rPr>
@@ -1235,6 +1291,7 @@
         <w:rPr>
           <w:rFonts w:ascii="Calibri" w:cs="Calibri" w:eastAsia="Calibri" w:hAnsi="Calibri"/>
           <w:b w:val="0"/>
+          <w:bCs w:val="0"/>
           <w:vertAlign w:val="baseline"/>
         </w:rPr>
       </w:pPr>
@@ -1323,6 +1380,7 @@
         <w:rPr>
           <w:rFonts w:ascii="Calibri" w:cs="Calibri" w:eastAsia="Calibri" w:hAnsi="Calibri"/>
           <w:b w:val="0"/>
+          <w:bCs w:val="0"/>
           <w:vertAlign w:val="baseline"/>
         </w:rPr>
       </w:pPr>
@@ -1339,6 +1397,7 @@
         <w:rPr>
           <w:rFonts w:ascii="Calibri" w:cs="Calibri" w:eastAsia="Calibri" w:hAnsi="Calibri"/>
           <w:b w:val="0"/>
+          <w:bCs w:val="0"/>
           <w:vertAlign w:val="baseline"/>
         </w:rPr>
       </w:pPr>
@@ -1360,6 +1419,7 @@
         <w:rPr>
           <w:rFonts w:ascii="Calibri" w:cs="Calibri" w:eastAsia="Calibri" w:hAnsi="Calibri"/>
           <w:b w:val="1"/>
+          <w:bCs w:val="1"/>
           <w:vertAlign w:val="baseline"/>
           <w:rtl w:val="0"/>
         </w:rPr>
@@ -1377,6 +1437,7 @@
         <w:rPr>
           <w:rFonts w:ascii="Calibri" w:cs="Calibri" w:eastAsia="Calibri" w:hAnsi="Calibri"/>
           <w:b w:val="1"/>
+          <w:bCs w:val="1"/>
           <w:vertAlign w:val="baseline"/>
           <w:rtl w:val="0"/>
         </w:rPr>
@@ -1415,10 +1476,10 @@
       <w:widowControl w:val="1"/>
       <w:pBdr>
         <w:top w:color="000000" w:space="1" w:sz="12" w:val="single"/>
-        <w:left w:space="0" w:sz="0" w:val="nil"/>
-        <w:bottom w:space="0" w:sz="0" w:val="nil"/>
-        <w:right w:space="0" w:sz="0" w:val="nil"/>
-        <w:between w:space="0" w:sz="0" w:val="nil"/>
+        <w:left w:color="000000" w:space="0" w:sz="0" w:val="none"/>
+        <w:bottom w:color="000000" w:space="0" w:sz="0" w:val="none"/>
+        <w:right w:color="000000" w:space="0" w:sz="0" w:val="none"/>
+        <w:between w:color="000000" w:space="0" w:sz="0" w:val="none"/>
       </w:pBdr>
       <w:shd w:fill="auto" w:val="clear"/>
       <w:tabs>
@@ -1431,7 +1492,9 @@
       <w:rPr>
         <w:rFonts w:ascii="Times New Roman" w:cs="Times New Roman" w:eastAsia="Times New Roman" w:hAnsi="Times New Roman"/>
         <w:b w:val="0"/>
+        <w:bCs w:val="0"/>
         <w:i w:val="0"/>
+        <w:iCs w:val="0"/>
         <w:smallCaps w:val="0"/>
         <w:strike w:val="0"/>
         <w:color w:val="000000"/>
@@ -1446,7 +1509,9 @@
       <w:rPr>
         <w:rFonts w:ascii="Times New Roman" w:cs="Times New Roman" w:eastAsia="Times New Roman" w:hAnsi="Times New Roman"/>
         <w:b w:val="0"/>
+        <w:bCs w:val="0"/>
         <w:i w:val="0"/>
+        <w:iCs w:val="0"/>
         <w:smallCaps w:val="0"/>
         <w:strike w:val="0"/>
         <w:color w:val="000000"/>
@@ -1465,13 +1530,15 @@
         <w:szCs w:val="16"/>
         <w:rtl w:val="0"/>
       </w:rPr>
-      <w:t xml:space="preserve">1/2025</w:t>
+      <w:t xml:space="preserve">1/2026</w:t>
     </w:r>
     <w:r>
       <w:rPr>
         <w:rFonts w:ascii="Times New Roman" w:cs="Times New Roman" w:eastAsia="Times New Roman" w:hAnsi="Times New Roman"/>
         <w:b w:val="0"/>
+        <w:bCs w:val="0"/>
         <w:i w:val="0"/>
+        <w:iCs w:val="0"/>
         <w:smallCaps w:val="0"/>
         <w:strike w:val="0"/>
         <w:color w:val="000000"/>
@@ -1488,7 +1555,9 @@
       <w:rPr>
         <w:rFonts w:ascii="Times New Roman" w:cs="Times New Roman" w:eastAsia="Times New Roman" w:hAnsi="Times New Roman"/>
         <w:b w:val="0"/>
+        <w:bCs w:val="0"/>
         <w:i w:val="0"/>
+        <w:iCs w:val="0"/>
         <w:smallCaps w:val="0"/>
         <w:strike w:val="0"/>
         <w:color w:val="000000"/>
@@ -1507,7 +1576,9 @@
       <w:rPr>
         <w:rFonts w:ascii="Times New Roman" w:cs="Times New Roman" w:eastAsia="Times New Roman" w:hAnsi="Times New Roman"/>
         <w:b w:val="0"/>
+        <w:bCs w:val="0"/>
         <w:i w:val="0"/>
+        <w:iCs w:val="0"/>
         <w:smallCaps w:val="0"/>
         <w:strike w:val="0"/>
         <w:color w:val="000000"/>
@@ -1528,10 +1599,10 @@
       <w:widowControl w:val="1"/>
       <w:pBdr>
         <w:top w:color="000000" w:space="1" w:sz="12" w:val="single"/>
-        <w:left w:space="0" w:sz="0" w:val="nil"/>
-        <w:bottom w:space="0" w:sz="0" w:val="nil"/>
-        <w:right w:space="0" w:sz="0" w:val="nil"/>
-        <w:between w:space="0" w:sz="0" w:val="nil"/>
+        <w:left w:color="000000" w:space="0" w:sz="0" w:val="none"/>
+        <w:bottom w:color="000000" w:space="0" w:sz="0" w:val="none"/>
+        <w:right w:color="000000" w:space="0" w:sz="0" w:val="none"/>
+        <w:between w:color="000000" w:space="0" w:sz="0" w:val="none"/>
       </w:pBdr>
       <w:shd w:fill="auto" w:val="clear"/>
       <w:tabs>
@@ -1544,7 +1615,9 @@
       <w:rPr>
         <w:rFonts w:ascii="Times New Roman" w:cs="Times New Roman" w:eastAsia="Times New Roman" w:hAnsi="Times New Roman"/>
         <w:b w:val="0"/>
+        <w:bCs w:val="0"/>
         <w:i w:val="0"/>
+        <w:iCs w:val="0"/>
         <w:smallCaps w:val="0"/>
         <w:strike w:val="0"/>
         <w:color w:val="000000"/>
@@ -1559,7 +1632,9 @@
       <w:rPr>
         <w:rFonts w:ascii="Times New Roman" w:cs="Times New Roman" w:eastAsia="Times New Roman" w:hAnsi="Times New Roman"/>
         <w:b w:val="0"/>
+        <w:bCs w:val="0"/>
         <w:i w:val="0"/>
+        <w:iCs w:val="0"/>
         <w:smallCaps w:val="0"/>
         <w:strike w:val="0"/>
         <w:color w:val="000000"/>
@@ -1580,10 +1655,10 @@
       <w:widowControl w:val="1"/>
       <w:pBdr>
         <w:top w:color="000000" w:space="1" w:sz="12" w:val="single"/>
-        <w:left w:space="0" w:sz="0" w:val="nil"/>
-        <w:bottom w:space="0" w:sz="0" w:val="nil"/>
-        <w:right w:space="0" w:sz="0" w:val="nil"/>
-        <w:between w:space="0" w:sz="0" w:val="nil"/>
+        <w:left w:color="000000" w:space="0" w:sz="0" w:val="none"/>
+        <w:bottom w:color="000000" w:space="0" w:sz="0" w:val="none"/>
+        <w:right w:color="000000" w:space="0" w:sz="0" w:val="none"/>
+        <w:between w:color="000000" w:space="0" w:sz="0" w:val="none"/>
       </w:pBdr>
       <w:shd w:fill="auto" w:val="clear"/>
       <w:tabs>
@@ -1596,7 +1671,9 @@
       <w:rPr>
         <w:rFonts w:ascii="Times New Roman" w:cs="Times New Roman" w:eastAsia="Times New Roman" w:hAnsi="Times New Roman"/>
         <w:b w:val="0"/>
+        <w:bCs w:val="0"/>
         <w:i w:val="0"/>
+        <w:iCs w:val="0"/>
         <w:smallCaps w:val="0"/>
         <w:strike w:val="0"/>
         <w:color w:val="000000"/>
@@ -1611,7 +1688,9 @@
       <w:rPr>
         <w:rFonts w:ascii="Times New Roman" w:cs="Times New Roman" w:eastAsia="Times New Roman" w:hAnsi="Times New Roman"/>
         <w:b w:val="0"/>
+        <w:bCs w:val="0"/>
         <w:i w:val="0"/>
+        <w:iCs w:val="0"/>
         <w:smallCaps w:val="0"/>
         <w:strike w:val="0"/>
         <w:color w:val="000000"/>
@@ -1631,11 +1710,11 @@
       <w:keepLines w:val="0"/>
       <w:widowControl w:val="1"/>
       <w:pBdr>
-        <w:top w:space="0" w:sz="0" w:val="nil"/>
-        <w:left w:space="0" w:sz="0" w:val="nil"/>
-        <w:bottom w:space="0" w:sz="0" w:val="nil"/>
-        <w:right w:space="0" w:sz="0" w:val="nil"/>
-        <w:between w:space="0" w:sz="0" w:val="nil"/>
+        <w:top w:color="000000" w:space="0" w:sz="0" w:val="none"/>
+        <w:left w:color="000000" w:space="0" w:sz="0" w:val="none"/>
+        <w:bottom w:color="000000" w:space="0" w:sz="0" w:val="none"/>
+        <w:right w:color="000000" w:space="0" w:sz="0" w:val="none"/>
+        <w:between w:color="000000" w:space="0" w:sz="0" w:val="none"/>
       </w:pBdr>
       <w:shd w:fill="auto" w:val="clear"/>
       <w:tabs>
@@ -1648,7 +1727,9 @@
       <w:rPr>
         <w:rFonts w:ascii="Times New Roman" w:cs="Times New Roman" w:eastAsia="Times New Roman" w:hAnsi="Times New Roman"/>
         <w:b w:val="0"/>
+        <w:bCs w:val="0"/>
         <w:i w:val="0"/>
+        <w:iCs w:val="0"/>
         <w:smallCaps w:val="0"/>
         <w:strike w:val="0"/>
         <w:color w:val="000000"/>
@@ -1671,11 +1752,11 @@
       <w:keepLines w:val="0"/>
       <w:widowControl w:val="1"/>
       <w:pBdr>
-        <w:top w:space="0" w:sz="0" w:val="nil"/>
-        <w:left w:space="0" w:sz="0" w:val="nil"/>
-        <w:bottom w:space="0" w:sz="0" w:val="nil"/>
-        <w:right w:space="0" w:sz="0" w:val="nil"/>
-        <w:between w:space="0" w:sz="0" w:val="nil"/>
+        <w:top w:color="000000" w:space="0" w:sz="0" w:val="none"/>
+        <w:left w:color="000000" w:space="0" w:sz="0" w:val="none"/>
+        <w:bottom w:color="000000" w:space="0" w:sz="0" w:val="none"/>
+        <w:right w:color="000000" w:space="0" w:sz="0" w:val="none"/>
+        <w:between w:color="000000" w:space="0" w:sz="0" w:val="none"/>
       </w:pBdr>
       <w:shd w:fill="auto" w:val="clear"/>
       <w:tabs>
@@ -1688,7 +1769,9 @@
       <w:rPr>
         <w:rFonts w:ascii="Times New Roman" w:cs="Times New Roman" w:eastAsia="Times New Roman" w:hAnsi="Times New Roman"/>
         <w:b w:val="0"/>
+        <w:bCs w:val="0"/>
         <w:i w:val="0"/>
+        <w:iCs w:val="0"/>
         <w:smallCaps w:val="0"/>
         <w:strike w:val="0"/>
         <w:color w:val="000000"/>
@@ -1831,20 +1914,29 @@
   <w:docDefaults>
     <w:rPrDefault>
       <w:rPr>
+        <w:rFonts w:ascii="Cambria" w:cs="Cambria" w:eastAsia="Cambria" w:hAnsi="Cambria"/>
         <w:sz w:val="24"/>
         <w:szCs w:val="24"/>
-        <w:lang w:val="pt_BR"/>
+        <w:lang w:val="zh_CN"/>
       </w:rPr>
     </w:rPrDefault>
     <w:pPrDefault>
       <w:pPr/>
     </w:pPrDefault>
   </w:docDefaults>
+  <w:style w:type="table" w:styleId="TableNormal" w:default="1">
+    <w:name w:val="TableNormal"/>
+    <w:tblPr>
+      <w:tblCellMar>
+        <w:top w:w="100.0" w:type="dxa"/>
+        <w:left w:w="100.0" w:type="dxa"/>
+        <w:bottom w:w="100.0" w:type="dxa"/>
+        <w:right w:w="100.0" w:type="dxa"/>
+      </w:tblCellMar>
+    </w:tblPr>
+  </w:style>
   <w:style w:type="paragraph" w:styleId="Normal" w:default="1">
     <w:name w:val="normal"/>
-  </w:style>
-  <w:style w:type="table" w:styleId="TableNormal" w:default="1">
-    <w:name w:val="TableNormal"/>
   </w:style>
   <w:style w:type="paragraph" w:styleId="Heading1">
     <w:name w:val="heading 1"/>
@@ -1858,6 +1950,7 @@
     </w:pPr>
     <w:rPr>
       <w:b w:val="1"/>
+      <w:bCs w:val="1"/>
       <w:sz w:val="48"/>
       <w:szCs w:val="48"/>
     </w:rPr>
@@ -1874,6 +1967,7 @@
     </w:pPr>
     <w:rPr>
       <w:b w:val="1"/>
+      <w:bCs w:val="1"/>
       <w:sz w:val="36"/>
       <w:szCs w:val="36"/>
     </w:rPr>
@@ -1890,6 +1984,7 @@
     </w:pPr>
     <w:rPr>
       <w:b w:val="1"/>
+      <w:bCs w:val="1"/>
       <w:sz w:val="28"/>
       <w:szCs w:val="28"/>
     </w:rPr>
@@ -1906,6 +2001,7 @@
     </w:pPr>
     <w:rPr>
       <w:b w:val="1"/>
+      <w:bCs w:val="1"/>
       <w:sz w:val="24"/>
       <w:szCs w:val="24"/>
     </w:rPr>
@@ -1922,6 +2018,7 @@
     </w:pPr>
     <w:rPr>
       <w:b w:val="1"/>
+      <w:bCs w:val="1"/>
       <w:sz w:val="22"/>
       <w:szCs w:val="22"/>
     </w:rPr>
@@ -1938,6 +2035,7 @@
     </w:pPr>
     <w:rPr>
       <w:b w:val="1"/>
+      <w:bCs w:val="1"/>
       <w:sz w:val="20"/>
       <w:szCs w:val="20"/>
     </w:rPr>
@@ -1954,124 +2052,7 @@
     </w:pPr>
     <w:rPr>
       <w:b w:val="1"/>
-      <w:sz w:val="72"/>
-      <w:szCs w:val="72"/>
-    </w:rPr>
-  </w:style>
-  <w:style w:type="paragraph" w:styleId="Normal" w:default="1">
-    <w:name w:val="normal"/>
-  </w:style>
-  <w:style w:type="table" w:styleId="TableNormal" w:default="1">
-    <w:name w:val="TableNormal"/>
-  </w:style>
-  <w:style w:type="paragraph" w:styleId="Heading1">
-    <w:name w:val="heading 1"/>
-    <w:basedOn w:val="Normal"/>
-    <w:next w:val="Normal"/>
-    <w:pPr>
-      <w:keepNext w:val="1"/>
-      <w:keepLines w:val="1"/>
-      <w:pageBreakBefore w:val="0"/>
-      <w:spacing w:after="120" w:before="480" w:lineRule="auto"/>
-    </w:pPr>
-    <w:rPr>
-      <w:b w:val="1"/>
-      <w:sz w:val="48"/>
-      <w:szCs w:val="48"/>
-    </w:rPr>
-  </w:style>
-  <w:style w:type="paragraph" w:styleId="Heading2">
-    <w:name w:val="heading 2"/>
-    <w:basedOn w:val="Normal"/>
-    <w:next w:val="Normal"/>
-    <w:pPr>
-      <w:keepNext w:val="1"/>
-      <w:keepLines w:val="1"/>
-      <w:pageBreakBefore w:val="0"/>
-      <w:spacing w:after="80" w:before="360" w:lineRule="auto"/>
-    </w:pPr>
-    <w:rPr>
-      <w:b w:val="1"/>
-      <w:sz w:val="36"/>
-      <w:szCs w:val="36"/>
-    </w:rPr>
-  </w:style>
-  <w:style w:type="paragraph" w:styleId="Heading3">
-    <w:name w:val="heading 3"/>
-    <w:basedOn w:val="Normal"/>
-    <w:next w:val="Normal"/>
-    <w:pPr>
-      <w:keepNext w:val="1"/>
-      <w:keepLines w:val="1"/>
-      <w:pageBreakBefore w:val="0"/>
-      <w:spacing w:after="80" w:before="280" w:lineRule="auto"/>
-    </w:pPr>
-    <w:rPr>
-      <w:b w:val="1"/>
-      <w:sz w:val="28"/>
-      <w:szCs w:val="28"/>
-    </w:rPr>
-  </w:style>
-  <w:style w:type="paragraph" w:styleId="Heading4">
-    <w:name w:val="heading 4"/>
-    <w:basedOn w:val="Normal"/>
-    <w:next w:val="Normal"/>
-    <w:pPr>
-      <w:keepNext w:val="1"/>
-      <w:keepLines w:val="1"/>
-      <w:pageBreakBefore w:val="0"/>
-      <w:spacing w:after="40" w:before="240" w:lineRule="auto"/>
-    </w:pPr>
-    <w:rPr>
-      <w:b w:val="1"/>
-      <w:sz w:val="24"/>
-      <w:szCs w:val="24"/>
-    </w:rPr>
-  </w:style>
-  <w:style w:type="paragraph" w:styleId="Heading5">
-    <w:name w:val="heading 5"/>
-    <w:basedOn w:val="Normal"/>
-    <w:next w:val="Normal"/>
-    <w:pPr>
-      <w:keepNext w:val="1"/>
-      <w:keepLines w:val="1"/>
-      <w:pageBreakBefore w:val="0"/>
-      <w:spacing w:after="40" w:before="220" w:lineRule="auto"/>
-    </w:pPr>
-    <w:rPr>
-      <w:b w:val="1"/>
-      <w:sz w:val="22"/>
-      <w:szCs w:val="22"/>
-    </w:rPr>
-  </w:style>
-  <w:style w:type="paragraph" w:styleId="Heading6">
-    <w:name w:val="heading 6"/>
-    <w:basedOn w:val="Normal"/>
-    <w:next w:val="Normal"/>
-    <w:pPr>
-      <w:keepNext w:val="1"/>
-      <w:keepLines w:val="1"/>
-      <w:pageBreakBefore w:val="0"/>
-      <w:spacing w:after="40" w:before="200" w:lineRule="auto"/>
-    </w:pPr>
-    <w:rPr>
-      <w:b w:val="1"/>
-      <w:sz w:val="20"/>
-      <w:szCs w:val="20"/>
-    </w:rPr>
-  </w:style>
-  <w:style w:type="paragraph" w:styleId="Title">
-    <w:name w:val="Title"/>
-    <w:basedOn w:val="Normal"/>
-    <w:next w:val="Normal"/>
-    <w:pPr>
-      <w:keepNext w:val="1"/>
-      <w:keepLines w:val="1"/>
-      <w:pageBreakBefore w:val="0"/>
-      <w:spacing w:after="120" w:before="480" w:lineRule="auto"/>
-    </w:pPr>
-    <w:rPr>
-      <w:b w:val="1"/>
+      <w:bCs w:val="1"/>
       <w:sz w:val="72"/>
       <w:szCs w:val="72"/>
     </w:rPr>
@@ -2089,24 +2070,7 @@
     <w:rPr>
       <w:rFonts w:ascii="Georgia" w:cs="Georgia" w:eastAsia="Georgia" w:hAnsi="Georgia"/>
       <w:i w:val="1"/>
-      <w:color w:val="666666"/>
-      <w:sz w:val="48"/>
-      <w:szCs w:val="48"/>
-    </w:rPr>
-  </w:style>
-  <w:style w:type="paragraph" w:styleId="Subtitle">
-    <w:name w:val="Subtitle"/>
-    <w:basedOn w:val="Normal"/>
-    <w:next w:val="Normal"/>
-    <w:pPr>
-      <w:keepNext w:val="1"/>
-      <w:keepLines w:val="1"/>
-      <w:pageBreakBefore w:val="0"/>
-      <w:spacing w:after="80" w:before="360" w:lineRule="auto"/>
-    </w:pPr>
-    <w:rPr>
-      <w:rFonts w:ascii="Georgia" w:cs="Georgia" w:eastAsia="Georgia" w:hAnsi="Georgia"/>
-      <w:i w:val="1"/>
+      <w:iCs w:val="1"/>
       <w:color w:val="666666"/>
       <w:sz w:val="48"/>
       <w:szCs w:val="48"/>
@@ -2437,7 +2401,7 @@
 
 <file path=customXML/item1.xml><?xml version="1.0" encoding="utf-8"?>
 <go:gDocsCustomXmlDataStorage xmlns:go="http://customooxmlschemas.google.com/" xmlns:r="http://schemas.openxmlformats.org/officeDocument/2006/relationships" uri="GoogleDocsCustomDataVersion2">
-  <go:docsCustomData xmlns:go="http://customooxmlschemas.google.com/" roundtripDataSignature="AMtx7mhZls/+GhzsxqfQubjYDA5b1keUfQ==">CgMxLjA4AHIhMVVzRktDZjZzZW85b1RNQUpXY29Lb0lCTU43LXVVQmZq</go:docsCustomData>
+  <go:docsCustomData xmlns:go="http://customooxmlschemas.google.com/" roundtripDataSignature="AMtx7mh4pvw1Vo7jCJyM4aD7HN+M/K3e/w==">CgMxLjAyDmgudmh6bXQxMzM3Z2ZqOAByITFGaU1xeTlLY3hLVDM4RFNwUjF6emJvVXRhZGdXQXkyTA==</go:docsCustomData>
 </go:gDocsCustomXmlDataStorage>
 </file>
 

</xml_diff>